<commit_message>
feat: Implement initial portfolio website with dynamic content, styling, and GitHub Pages deployment.
</commit_message>
<xml_diff>
--- a/CV (Fraser Rackham) Jan 2026.docx
+++ b/CV (Fraser Rackham) Jan 2026.docx
@@ -2099,31 +2099,7 @@
         <w:rPr>
           <w:sz w:val="15"/>
         </w:rPr>
-        <w:t xml:space="preserve"> 0</w:t>
-      </w:r>
-      <w:r>
-        <w:rPr>
-          <w:sz w:val="15"/>
-        </w:rPr>
-        <w:t>8</w:t>
-      </w:r>
-      <w:r>
-        <w:rPr>
-          <w:sz w:val="15"/>
-        </w:rPr>
-        <w:t>/202</w:t>
-      </w:r>
-      <w:r>
-        <w:rPr>
-          <w:sz w:val="15"/>
-        </w:rPr>
-        <w:t>5</w:t>
-      </w:r>
-      <w:r>
-        <w:rPr>
-          <w:sz w:val="15"/>
-        </w:rPr>
-        <w:t xml:space="preserve"> - Present </w:t>
+        <w:t xml:space="preserve"> 08/2025 - Present </w:t>
       </w:r>
       <w:r>
         <w:rPr>
@@ -2142,28 +2118,7 @@
         <w:ind w:right="33" w:hanging="182"/>
       </w:pPr>
       <w:r>
-        <w:t>Responsible</w:t>
-      </w:r>
-      <w:r>
-        <w:t xml:space="preserve"> for charity technology delivery</w:t>
-      </w:r>
-      <w:r>
-        <w:t xml:space="preserve">, including </w:t>
-      </w:r>
-      <w:r>
-        <w:t>m</w:t>
-      </w:r>
-      <w:r>
-        <w:t>anag</w:t>
-      </w:r>
-      <w:r>
-        <w:t>ing</w:t>
-      </w:r>
-      <w:r>
-        <w:t xml:space="preserve"> £1M+ technology budget, optimizing vendor relationships and build/buy decisions</w:t>
-      </w:r>
-      <w:r>
-        <w:t xml:space="preserve">. </w:t>
+        <w:t>Responsible for all technology delivery across the charity, managing a £1M+ budget and leading engineering, QA, UX, product, data, and IT operations.</w:t>
       </w:r>
     </w:p>
     <w:p>
@@ -2175,18 +2130,7 @@
         <w:ind w:right="33" w:hanging="182"/>
       </w:pPr>
       <w:r>
-        <w:t xml:space="preserve">Led technology strategy for [charity serving X young people/schools], aligning technical roadmap with </w:t>
-      </w:r>
-      <w:r>
-        <w:t xml:space="preserve">charity </w:t>
-      </w:r>
-      <w:proofErr w:type="gramStart"/>
-      <w:r>
-        <w:t>5 year</w:t>
-      </w:r>
-      <w:proofErr w:type="gramEnd"/>
-      <w:r>
-        <w:t xml:space="preserve"> strategy KPIs.</w:t>
+        <w:t>Lead technology strategy serving 35,000 young people annually, aligning technical roadmap with the charity's 5-year strategic plan and maintaining 99.9% platform uptime.</w:t>
       </w:r>
     </w:p>
     <w:p>
@@ -2198,33 +2142,24 @@
         <w:ind w:right="33" w:hanging="182"/>
       </w:pPr>
       <w:r>
-        <w:t xml:space="preserve">Prototyping for a white-labelling exercise for working with wider local authorities, </w:t>
-      </w:r>
-      <w:proofErr w:type="spellStart"/>
-      <w:r>
-        <w:t>foscused</w:t>
-      </w:r>
-      <w:proofErr w:type="spellEnd"/>
-      <w:r>
-        <w:t xml:space="preserve"> on raising the number of employers we can reach.</w:t>
+        <w:t>Accountable for data protection, GDPR compliance, and safeguarding requirements. Member of Senior Leadership Team contributing to organizational strategy, business planning, and funding decisions.</w:t>
       </w:r>
     </w:p>
     <w:p>
       <w:pPr>
+        <w:pStyle w:val="ListParagraph"/>
         <w:numPr>
           <w:ilvl w:val="0"/>
           <w:numId w:val="1"/>
         </w:numPr>
-        <w:ind w:right="33" w:hanging="182"/>
       </w:pPr>
       <w:r>
-        <w:t>"Led technology enabling [X] young people to access work experience/opportunities, with platform reliability and performance improvements directly contributing to [Y]% increase in engagement from underserved communities"</w:t>
+        <w:t>Prototyping white-labelling solution for local authority partnerships to expand employer reach and service impact.</w:t>
       </w:r>
     </w:p>
     <w:p>
       <w:pPr>
-        <w:pStyle w:val="Heading2"/>
-        <w:ind w:left="-5"/>
+        <w:ind w:left="52" w:firstLine="0"/>
       </w:pPr>
     </w:p>
     <w:p>
@@ -3234,13 +3169,13 @@
           <w:ilvl w:val="0"/>
           <w:numId w:val="1"/>
         </w:numPr>
-        <w:ind w:right="33" w:hanging="182"/>
+        <w:ind w:right="33"/>
       </w:pPr>
       <w:r>
-        <w:t>Led engineering teams to drive product delivery, enhance developer outcomes, and oversee major changes aligned with the charity's strategic goals, sustaining morale and retention through contractor reductions that saved over £600k</w:t>
-      </w:r>
-      <w:r>
-        <w:t>.</w:t>
+        <w:t>Led engineering teams through contractor reduction saving £600k+ while sustaining morale, retention, and delivery quality.</w:t>
+      </w:r>
+      <w:r>
+        <w:t xml:space="preserve"> </w:t>
       </w:r>
     </w:p>
     <w:p>
@@ -3252,7 +3187,7 @@
         <w:ind w:right="33"/>
       </w:pPr>
       <w:r>
-        <w:t xml:space="preserve">Resolved structural challenges decisively, such as ending long-running contractor relationships which were no longer meeting charity needs for cost, timeliness and delivery quality.  </w:t>
+        <w:t>Achieved high-performing operation aligned with DORA research: reduced release frequency from 2 months to 2 weeks while maintaining 99.95% uptime and low change failure rates, improving cost-per-user and NPS scores.</w:t>
       </w:r>
     </w:p>
     <w:p>
@@ -3261,10 +3196,10 @@
           <w:ilvl w:val="0"/>
           <w:numId w:val="1"/>
         </w:numPr>
-        <w:ind w:right="33" w:hanging="182"/>
+        <w:ind w:right="33"/>
       </w:pPr>
       <w:r>
-        <w:t>Achieved a high-performing engineering operation aligned with DORA/Accelerate research by reducing release frequency (from 2 months to 2 weeks in Q1/2 2024) while sustaining low change failure rate and 99.95% uptime, resulting in cost-per-user reductions and improved user satisfaction (tracked by NPS across user types).</w:t>
+        <w:t>Member of Programme Board, providing costed technical proposals and architectural options for funder investments.</w:t>
       </w:r>
     </w:p>
     <w:p>
@@ -3273,28 +3208,10 @@
           <w:ilvl w:val="0"/>
           <w:numId w:val="1"/>
         </w:numPr>
-        <w:ind w:right="33" w:hanging="182"/>
+        <w:ind w:right="33"/>
       </w:pPr>
       <w:r>
-        <w:t>Regularly attend and act at SLT meetings in any absence of the Technical Director</w:t>
-      </w:r>
-      <w:r>
-        <w:t>, and member of the Programme Board focusing on business plan execution and product fit</w:t>
-      </w:r>
-      <w:r>
-        <w:t xml:space="preserve">, for example providing costed </w:t>
-      </w:r>
-      <w:r>
-        <w:t>breakdowns</w:t>
-      </w:r>
-      <w:r>
-        <w:t xml:space="preserve"> and propos</w:t>
-      </w:r>
-      <w:r>
-        <w:t>ing</w:t>
-      </w:r>
-      <w:r>
-        <w:t xml:space="preserve"> exploratory architectures for optional investments in 25/26 for our main funder.</w:t>
+        <w:t>Led architectural strategy implementing event-driven architecture, deprecating legacy services, and removing all VMs in favor of SaaS alternatives—eliminating significant security threat vectors.</w:t>
       </w:r>
     </w:p>
     <w:p>
@@ -3303,87 +3220,18 @@
           <w:ilvl w:val="0"/>
           <w:numId w:val="1"/>
         </w:numPr>
-        <w:ind w:right="33" w:hanging="182"/>
+        <w:ind w:right="33"/>
       </w:pPr>
       <w:r>
-        <w:t xml:space="preserve">Mentored technical leads on process transformation and team leadership, fostering a high-performance culture focused on professional growth, operational excellence (e.g., support SLAs, Azure Data Factory, SQL change control), and best practices </w:t>
-      </w:r>
-      <w:r>
-        <w:t xml:space="preserve">such as more frequent and stable release cycles </w:t>
-      </w:r>
-      <w:r>
-        <w:t>and feature flagging</w:t>
-      </w:r>
-      <w:r>
-        <w:t>.</w:t>
+        <w:t>Sustained quality outcomes as QA team reduced from 4 to 1, tracked via external pen tests, internal bugs, and Azure Defender scores.</w:t>
       </w:r>
     </w:p>
     <w:p>
       <w:pPr>
-        <w:numPr>
-          <w:ilvl w:val="0"/>
-          <w:numId w:val="1"/>
-        </w:numPr>
-        <w:ind w:right="33" w:hanging="182"/>
+        <w:pStyle w:val="Heading2"/>
+        <w:spacing w:before="0"/>
+        <w:ind w:left="-5"/>
       </w:pPr>
-      <w:r>
-        <w:t>Worked with high performers to broaden and deepen their roles, while also taking other employees through PIPs (performance improvement plans), with significant improvements in both cases against goals and retention of the staff involved.</w:t>
-      </w:r>
-      <w:r>
-        <w:t xml:space="preserve"> </w:t>
-      </w:r>
-    </w:p>
-    <w:p>
-      <w:pPr>
-        <w:numPr>
-          <w:ilvl w:val="0"/>
-          <w:numId w:val="1"/>
-        </w:numPr>
-        <w:ind w:right="33" w:hanging="182"/>
-      </w:pPr>
-      <w:r>
-        <w:t xml:space="preserve">Sustained quality outcomes </w:t>
-      </w:r>
-      <w:r>
-        <w:t xml:space="preserve">during </w:t>
-      </w:r>
-      <w:r>
-        <w:t xml:space="preserve">a drop of QA team size from 4 to </w:t>
-      </w:r>
-      <w:r>
-        <w:t>1, tracked by external pen</w:t>
-      </w:r>
-      <w:r>
-        <w:t>etration</w:t>
-      </w:r>
-      <w:r>
-        <w:t xml:space="preserve"> tests, internal bugs and Azure Defender for Cloud security scores.</w:t>
-      </w:r>
-    </w:p>
-    <w:p>
-      <w:pPr>
-        <w:numPr>
-          <w:ilvl w:val="0"/>
-          <w:numId w:val="1"/>
-        </w:numPr>
-        <w:spacing w:after="222"/>
-        <w:ind w:right="33" w:hanging="182"/>
-      </w:pPr>
-      <w:r>
-        <w:t>Led architectural strategy</w:t>
-      </w:r>
-      <w:r>
-        <w:t xml:space="preserve"> and defined the technical roadmap</w:t>
-      </w:r>
-      <w:r>
-        <w:t>, working hands-on with backend and frontend leads to implement event-driven architecture, integrate systems to deprecate unneeded services</w:t>
-      </w:r>
-      <w:r>
-        <w:t>, such as removing all virtual machines and replacing with SaaS alternatives which removed a significant security threat vector.</w:t>
-      </w:r>
-      <w:r>
-        <w:t xml:space="preserve"> </w:t>
-      </w:r>
     </w:p>
     <w:p>
       <w:pPr>
@@ -4462,10 +4310,7 @@
         <w:ind w:right="33"/>
       </w:pPr>
       <w:r>
-        <w:t xml:space="preserve">Collaborated regularly with internal and external stakeholders—including programme and product specialists, key technology vendors, consultants, and others (e.g., Azure </w:t>
-      </w:r>
-      <w:r>
-        <w:t xml:space="preserve">CSP, recruiters)—to present security outcomes to the leadership group and gain buy-in for extending pen-test coverage </w:t>
+        <w:t xml:space="preserve">Collaborated regularly with internal and external stakeholders—including programme and product specialists, key technology vendors, consultants, and others (e.g., Azure CSP, recruiters)—to present security outcomes to the leadership group and gain buy-in for extending pen-test coverage </w:t>
       </w:r>
       <w:r>
         <w:t xml:space="preserve">to systems not owned by our </w:t>
@@ -4522,23 +4367,7 @@
         <w:ind w:right="33"/>
       </w:pPr>
       <w:r>
-        <w:t xml:space="preserve">Implemented integration with the </w:t>
-      </w:r>
-      <w:proofErr w:type="spellStart"/>
-      <w:r>
-        <w:t>Groupcall</w:t>
-      </w:r>
-      <w:proofErr w:type="spellEnd"/>
-      <w:r>
-        <w:t xml:space="preserve"> </w:t>
-      </w:r>
-      <w:proofErr w:type="spellStart"/>
-      <w:r>
-        <w:t>Xporter</w:t>
-      </w:r>
-      <w:proofErr w:type="spellEnd"/>
-      <w:r>
-        <w:t xml:space="preserve"> API, including an onboarding experience for headteacher signoff, for an MIS trial integration. Planned, led, and monitored a successful trial with several schools</w:t>
+        <w:t>Implemented integration with the Groupcall Xporter API, including an onboarding experience for headteacher signoff, for an MIS trial integration. Planned, led, and monitored a successful trial with several schools</w:t>
       </w:r>
       <w:r>
         <w:t>, on the back of sustained engagement with the vendor.</w:t>
@@ -4625,25 +4454,25 @@
       </w:r>
       <w:r>
         <w:rPr>
-          <w:color w:val="EE0000"/>
+          <w:color w:val="auto"/>
         </w:rPr>
         <w:t xml:space="preserve">secondary </w:t>
       </w:r>
       <w:r>
         <w:rPr>
-          <w:color w:val="EE0000"/>
+          <w:color w:val="auto"/>
         </w:rPr>
         <w:t>school Data Manager and Senior Leader for non-teaching staf</w:t>
       </w:r>
       <w:r>
         <w:rPr>
-          <w:color w:val="EE0000"/>
+          <w:color w:val="auto"/>
         </w:rPr>
         <w:t>f.</w:t>
       </w:r>
       <w:r>
         <w:rPr>
-          <w:color w:val="EE0000"/>
+          <w:color w:val="auto"/>
         </w:rPr>
         <w:t xml:space="preserve"> </w:t>
       </w:r>
@@ -10554,11 +10383,10 @@
           <w:color w:val="000000"/>
           <w:sz w:val="22"/>
         </w:rPr>
-        <w:lastRenderedPageBreak/>
         <mc:AlternateContent>
           <mc:Choice Requires="wpg">
             <w:drawing>
-              <wp:inline distT="0" distB="0" distL="0" distR="0" wp14:anchorId="28EA5D25" wp14:editId="471058CA">
+              <wp:inline distT="0" distB="0" distL="0" distR="0" wp14:anchorId="28EA5D25" wp14:editId="4EF2C2BA">
                 <wp:extent cx="2459355" cy="170160"/>
                 <wp:effectExtent l="0" t="0" r="0" b="1905"/>
                 <wp:docPr id="1576217358" name="Group 1576217358"/>
@@ -11368,7 +11196,7 @@
                             </a:pathLst>
                           </a:custGeom>
                           <a:solidFill>
-                            <a:srgbClr val="E4E4E4"/>
+                            <a:srgbClr val="1E90FF"/>
                           </a:solidFill>
                           <a:ln w="0" cap="flat">
                             <a:miter lim="127000"/>
@@ -11632,7 +11460,7 @@
           </mc:Choice>
           <mc:Fallback>
             <w:pict>
-              <v:group w14:anchorId="28EA5D25" id="Group 1576217358" o:spid="_x0000_s1064" style="width:193.65pt;height:13.4pt;mso-position-horizontal-relative:char;mso-position-vertical-relative:line" coordorigin=",1611" coordsize="24811,1722" o:gfxdata="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">
+              <v:group w14:anchorId="28EA5D25" id="Group 1576217358" o:spid="_x0000_s1064" style="width:193.65pt;height:13.4pt;mso-position-horizontal-relative:char;mso-position-vertical-relative:line" coordorigin=",1611" coordsize="24811,1722" o:gfxdata="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">
                 <v:shape id="Shape 420" o:spid="_x0000_s1065" style="position:absolute;left:17078;top:1611;width:1289;height:1289;visibility:visible;mso-wrap-style:square;v-text-anchor:top" coordsize="128892,128892" o:gfxdata="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" path="m64446,v4231,,8422,413,12573,1239c81168,2064,85198,3287,89108,4905v3909,1619,7623,3605,11142,5955c103768,13212,107023,15884,110015,18876v2992,2992,5664,6246,8015,9766c120381,32159,122366,35874,123985,39783v1619,3909,2842,7939,3668,12090c128478,56023,128891,60214,128892,64446v-1,4231,-415,8422,-1240,12572c126826,81168,125604,85198,123985,89107v-1620,3909,-3604,7624,-5956,11142c115679,103767,113007,107023,110015,110016v-2992,2992,-6247,5664,-9765,8014c96731,120381,93017,122366,89108,123985v-3910,1620,-7940,2842,-12089,3668c72868,128478,68677,128891,64446,128892v-4232,-1,-8423,-414,-12574,-1239c47722,126827,43692,125605,39782,123985v-3909,-1620,-7622,-3604,-11141,-5955c25122,115679,21867,113008,18875,110016v-2992,-2993,-5664,-6249,-8015,-9766c8509,96731,6524,93018,4905,89108,3286,85198,2064,81168,1238,77018,413,72868,,68677,,64446,,60214,413,56023,1238,51873,2064,47722,3286,43692,4905,39783,6524,35874,8509,32159,10860,28641v2351,-3519,5023,-6773,8015,-9765c21867,15884,25122,13212,28641,10861,32160,8510,35873,6524,39782,4905,43692,3287,47722,2064,51872,1239,56023,413,60214,,64446,xe" fillcolor="#1e90ff" stroked="f" strokeweight="0">
                   <v:stroke miterlimit="83231f" joinstyle="miter"/>
                   <v:path arrowok="t" textboxrect="0,0,128892,128892"/>
@@ -11645,7 +11473,7 @@
                   <v:stroke miterlimit="83231f" joinstyle="miter"/>
                   <v:path arrowok="t" textboxrect="0,0,128892,128892"/>
                 </v:shape>
-                <v:shape id="Shape 423" o:spid="_x0000_s1068" style="position:absolute;left:21911;top:1611;width:1289;height:1289;visibility:visible;mso-wrap-style:square;v-text-anchor:top" coordsize="128892,128892" o:gfxdata="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" path="m64446,v4231,,8422,413,12572,1239c81169,2064,85198,3287,89108,4905v3909,1619,7623,3605,11141,5955c103768,13212,107024,15884,110016,18876v2992,2992,5663,6246,8014,9766c120380,32159,122366,35874,123985,39783v1620,3909,2842,7939,3668,12090c128478,56023,128891,60214,128892,64446v-1,4231,-414,8422,-1239,12572c126827,81168,125605,85198,123985,89107v-1619,3909,-3605,7624,-5955,11142c115679,103767,113008,107023,110016,110016v-2992,2992,-6248,5664,-9767,8014c96731,120381,93017,122366,89108,123985v-3910,1620,-7939,2842,-12090,3668c72868,128478,68677,128891,64446,128892v-4232,-1,-8423,-414,-12573,-1239c47723,126827,43693,125605,39783,123985v-3909,-1620,-7623,-3604,-11141,-5955c25123,115679,21868,113008,18876,110016v-2992,-2993,-5664,-6249,-8015,-9766c8510,96731,6524,93018,4905,89108,3286,85198,2063,81168,1238,77018,412,72868,,68677,1,64446,,60214,412,56023,1238,51873,2063,47722,3286,43692,4905,39783,6524,35874,8510,32159,10861,28641v2351,-3519,5023,-6773,8015,-9765c21868,15884,25123,13212,28642,10861,32160,8510,35874,6524,39783,4905,43693,3287,47723,2064,51873,1239,56023,413,60214,,64446,xe" fillcolor="#e4e4e4" stroked="f" strokeweight="0">
+                <v:shape id="Shape 423" o:spid="_x0000_s1068" style="position:absolute;left:21911;top:1611;width:1289;height:1289;visibility:visible;mso-wrap-style:square;v-text-anchor:top" coordsize="128892,128892" o:gfxdata="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" path="m64446,v4231,,8422,413,12572,1239c81169,2064,85198,3287,89108,4905v3909,1619,7623,3605,11141,5955c103768,13212,107024,15884,110016,18876v2992,2992,5663,6246,8014,9766c120380,32159,122366,35874,123985,39783v1620,3909,2842,7939,3668,12090c128478,56023,128891,60214,128892,64446v-1,4231,-414,8422,-1239,12572c126827,81168,125605,85198,123985,89107v-1619,3909,-3605,7624,-5955,11142c115679,103767,113008,107023,110016,110016v-2992,2992,-6248,5664,-9767,8014c96731,120381,93017,122366,89108,123985v-3910,1620,-7939,2842,-12090,3668c72868,128478,68677,128891,64446,128892v-4232,-1,-8423,-414,-12573,-1239c47723,126827,43693,125605,39783,123985v-3909,-1620,-7623,-3604,-11141,-5955c25123,115679,21868,113008,18876,110016v-2992,-2993,-5664,-6249,-8015,-9766c8510,96731,6524,93018,4905,89108,3286,85198,2063,81168,1238,77018,412,72868,,68677,1,64446,,60214,412,56023,1238,51873,2063,47722,3286,43692,4905,39783,6524,35874,8510,32159,10861,28641v2351,-3519,5023,-6773,8015,-9765c21868,15884,25123,13212,28642,10861,32160,8510,35874,6524,39783,4905,43693,3287,47723,2064,51873,1239,56023,413,60214,,64446,xe" fillcolor="#1e90ff" stroked="f" strokeweight="0">
                   <v:stroke miterlimit="83231f" joinstyle="miter"/>
                   <v:path arrowok="t" textboxrect="0,0,128892,128892"/>
                 </v:shape>
@@ -17451,11 +17279,9 @@
         <w:pStyle w:val="Heading3"/>
         <w:ind w:left="-5"/>
       </w:pPr>
-      <w:proofErr w:type="spellStart"/>
       <w:r>
         <w:t>BeyondTrust</w:t>
       </w:r>
-      <w:proofErr w:type="spellEnd"/>
       <w:r>
         <w:tab/>
       </w:r>
@@ -21555,15 +21381,7 @@
         <w:ind w:left="243" w:right="34" w:hanging="181"/>
       </w:pPr>
       <w:r>
-        <w:t xml:space="preserve">Raised C# </w:t>
-      </w:r>
-      <w:proofErr w:type="spellStart"/>
-      <w:r>
-        <w:t>NUnit</w:t>
-      </w:r>
-      <w:proofErr w:type="spellEnd"/>
-      <w:r>
-        <w:t xml:space="preserve"> test coverage from below 10% to above 90</w:t>
+        <w:t>Raised C# NUnit test coverage from below 10% to above 90</w:t>
       </w:r>
       <w:r>
         <w:t>%</w:t>
@@ -21767,23 +21585,7 @@
           <w:b/>
           <w:sz w:val="18"/>
         </w:rPr>
-        <w:t xml:space="preserve">, Azure </w:t>
-      </w:r>
-      <w:proofErr w:type="spellStart"/>
-      <w:r>
-        <w:rPr>
-          <w:b/>
-          <w:sz w:val="18"/>
-        </w:rPr>
-        <w:t>Devops</w:t>
-      </w:r>
-      <w:proofErr w:type="spellEnd"/>
-      <w:r>
-        <w:rPr>
-          <w:b/>
-          <w:sz w:val="18"/>
-        </w:rPr>
-        <w:t xml:space="preserve">, C#, </w:t>
+        <w:t xml:space="preserve">, Azure Devops, C#, </w:t>
       </w:r>
       <w:r>
         <w:rPr>
@@ -21813,37 +21615,12 @@
         </w:rPr>
         <w:t xml:space="preserve">, Entity Framework, GitHub, </w:t>
       </w:r>
-      <w:proofErr w:type="spellStart"/>
       <w:r>
         <w:rPr>
           <w:b/>
           <w:sz w:val="18"/>
         </w:rPr>
-        <w:t>Github</w:t>
-      </w:r>
-      <w:proofErr w:type="spellEnd"/>
-      <w:r>
-        <w:rPr>
-          <w:b/>
-          <w:sz w:val="18"/>
-        </w:rPr>
-        <w:t xml:space="preserve"> Actions, </w:t>
-      </w:r>
-      <w:proofErr w:type="spellStart"/>
-      <w:r>
-        <w:rPr>
-          <w:b/>
-          <w:sz w:val="18"/>
-        </w:rPr>
-        <w:t>Github</w:t>
-      </w:r>
-      <w:proofErr w:type="spellEnd"/>
-      <w:r>
-        <w:rPr>
-          <w:b/>
-          <w:sz w:val="18"/>
-        </w:rPr>
-        <w:t xml:space="preserve"> Copilot, </w:t>
+        <w:t xml:space="preserve">Github Actions, Github Copilot, </w:t>
       </w:r>
       <w:r>
         <w:rPr>
@@ -21880,7 +21657,6 @@
         </w:rPr>
         <w:t xml:space="preserve">, Karma, </w:t>
       </w:r>
-      <w:proofErr w:type="spellStart"/>
       <w:r>
         <w:rPr>
           <w:b/>
@@ -21888,7 +21664,27 @@
         </w:rPr>
         <w:t>npm</w:t>
       </w:r>
-      <w:proofErr w:type="spellEnd"/>
+      <w:r>
+        <w:rPr>
+          <w:b/>
+          <w:sz w:val="18"/>
+        </w:rPr>
+        <w:t xml:space="preserve">, NUnit, </w:t>
+      </w:r>
+      <w:r>
+        <w:rPr>
+          <w:b/>
+          <w:sz w:val="18"/>
+        </w:rPr>
+        <w:t xml:space="preserve">Playwright, </w:t>
+      </w:r>
+      <w:r>
+        <w:rPr>
+          <w:b/>
+          <w:sz w:val="18"/>
+        </w:rPr>
+        <w:t>Postman, PowerShell</w:t>
+      </w:r>
       <w:r>
         <w:rPr>
           <w:b/>
@@ -21896,43 +21692,6 @@
         </w:rPr>
         <w:t xml:space="preserve">, </w:t>
       </w:r>
-      <w:proofErr w:type="spellStart"/>
-      <w:r>
-        <w:rPr>
-          <w:b/>
-          <w:sz w:val="18"/>
-        </w:rPr>
-        <w:t>NUnit</w:t>
-      </w:r>
-      <w:proofErr w:type="spellEnd"/>
-      <w:r>
-        <w:rPr>
-          <w:b/>
-          <w:sz w:val="18"/>
-        </w:rPr>
-        <w:t xml:space="preserve">, </w:t>
-      </w:r>
-      <w:r>
-        <w:rPr>
-          <w:b/>
-          <w:sz w:val="18"/>
-        </w:rPr>
-        <w:t xml:space="preserve">Playwright, </w:t>
-      </w:r>
-      <w:r>
-        <w:rPr>
-          <w:b/>
-          <w:sz w:val="18"/>
-        </w:rPr>
-        <w:t>Postman, PowerShell</w:t>
-      </w:r>
-      <w:r>
-        <w:rPr>
-          <w:b/>
-          <w:sz w:val="18"/>
-        </w:rPr>
-        <w:t xml:space="preserve">, </w:t>
-      </w:r>
       <w:r>
         <w:rPr>
           <w:b/>
@@ -21980,17 +21739,8 @@
           <w:b/>
           <w:sz w:val="18"/>
         </w:rPr>
-        <w:t>Qube/</w:t>
-      </w:r>
-      <w:proofErr w:type="spellStart"/>
-      <w:r>
-        <w:rPr>
-          <w:b/>
-          <w:sz w:val="18"/>
-        </w:rPr>
-        <w:t>SonarCloud</w:t>
-      </w:r>
-      <w:proofErr w:type="spellEnd"/>
+        <w:t>Qube/SonarCloud</w:t>
+      </w:r>
       <w:r>
         <w:rPr>
           <w:b/>
@@ -22032,7 +21782,6 @@
         <w:ind w:left="-5"/>
       </w:pPr>
       <w:r>
-        <w:lastRenderedPageBreak/>
         <w:t>EDUCATION</w:t>
       </w:r>
     </w:p>
@@ -25033,6 +24782,7 @@
         <w:ind w:left="-5"/>
       </w:pPr>
       <w:r>
+        <w:lastRenderedPageBreak/>
         <w:t>EXPERIENCE</w:t>
       </w:r>
     </w:p>
@@ -26037,15 +25787,7 @@
         <w:t xml:space="preserve">teaching </w:t>
       </w:r>
       <w:r>
-        <w:t xml:space="preserve">staff to see the achievement of each student, </w:t>
-      </w:r>
-      <w:proofErr w:type="gramStart"/>
-      <w:r>
-        <w:t>at all times</w:t>
-      </w:r>
-      <w:proofErr w:type="gramEnd"/>
-      <w:r>
-        <w:t>.</w:t>
+        <w:t>staff to see the achievement of each student, at all times.</w:t>
       </w:r>
     </w:p>
     <w:p>
@@ -28034,15 +27776,7 @@
         <w:ind w:right="33" w:hanging="182"/>
       </w:pPr>
       <w:r>
-        <w:t xml:space="preserve">During this time, I was a staff governor (liaising with support staff as their representative on the governing body), as well as delivering my own training to governors on </w:t>
-      </w:r>
-      <w:proofErr w:type="spellStart"/>
-      <w:r>
-        <w:t>RAISEonline</w:t>
-      </w:r>
-      <w:proofErr w:type="spellEnd"/>
-      <w:r>
-        <w:t xml:space="preserve">, the use of data and data-driven governance, receiving feedback that it was ‘the best training on data I’ve been to’. I also worked alongside the chair on a trial evidencing the NGA’s 20 </w:t>
+        <w:t xml:space="preserve">During this time, I was a staff governor (liaising with support staff as their representative on the governing body), as well as delivering my own training to governors on RAISEonline, the use of data and data-driven governance, receiving feedback that it was ‘the best training on data I’ve been to’. I also worked alongside the chair on a trial evidencing the NGA’s 20 </w:t>
       </w:r>
       <w:r>
         <w:t xml:space="preserve">self-evaluation </w:t>
@@ -28105,15 +27839,7 @@
         <w:t>Responsibility for data management</w:t>
       </w:r>
       <w:r>
-        <w:t xml:space="preserve"> and systems such as Alps, 4Matrix, </w:t>
-      </w:r>
-      <w:proofErr w:type="spellStart"/>
-      <w:r>
-        <w:t>RAISEonline</w:t>
-      </w:r>
-      <w:proofErr w:type="spellEnd"/>
-      <w:r>
-        <w:t xml:space="preserve"> and SIMS Assessment (MIS),</w:t>
+        <w:t xml:space="preserve"> and systems such as Alps, 4Matrix, RAISEonline and SIMS Assessment (MIS),</w:t>
       </w:r>
       <w:r>
         <w:t xml:space="preserve"> including designing reports such as compliance returns (determining school funding) and responsibility for tracking of</w:t>
@@ -28137,15 +27863,7 @@
         <w:ind w:right="33" w:hanging="182"/>
       </w:pPr>
       <w:r>
-        <w:t xml:space="preserve">Collaborated with data managers across the </w:t>
-      </w:r>
-      <w:proofErr w:type="spellStart"/>
-      <w:r>
-        <w:t>LaSwap</w:t>
-      </w:r>
-      <w:proofErr w:type="spellEnd"/>
-      <w:r>
-        <w:t xml:space="preserve"> 6</w:t>
+        <w:t>Collaborated with data managers across the LaSwap 6</w:t>
       </w:r>
       <w:r>
         <w:rPr>
@@ -29247,6 +28965,21 @@
           <w:sz w:val="15"/>
         </w:rPr>
         <w:tab/>
+      </w:r>
+    </w:p>
+    <w:p>
+      <w:pPr>
+        <w:numPr>
+          <w:ilvl w:val="0"/>
+          <w:numId w:val="11"/>
+        </w:numPr>
+        <w:ind w:right="33" w:hanging="182"/>
+      </w:pPr>
+      <w:r>
+        <w:t>Worked with teachers to understand their data, impact and efficiencies offered by our systems for their work and impact on young people</w:t>
+      </w:r>
+      <w:r>
+        <w:t xml:space="preserve"> across internal and external systems.</w:t>
       </w:r>
     </w:p>
     <w:p>
@@ -32422,6 +32155,17 @@
       <w:sz w:val="24"/>
     </w:rPr>
   </w:style>
+  <w:style w:type="paragraph" w:styleId="ListParagraph">
+    <w:name w:val="List Paragraph"/>
+    <w:basedOn w:val="Normal"/>
+    <w:uiPriority w:val="34"/>
+    <w:qFormat/>
+    <w:rsid w:val="00DE1FFB"/>
+    <w:pPr>
+      <w:ind w:left="720"/>
+      <w:contextualSpacing/>
+    </w:pPr>
+  </w:style>
 </w:styles>
 </file>
 

</xml_diff>